<commit_message>
Restore previous resume style with project links
</commit_message>
<xml_diff>
--- a/Yousef_A_Hassan_Resume.docx
+++ b/Yousef_A_Hassan_Resume.docx
@@ -4,16 +4,13 @@
   <w:body>
     <w:p>
       <w:pPr>
-        <w:keepNext w:val="0"/>
-        <w:widowControl/>
-        <w:spacing w:before="0" w:after="0" w:line="216" w:lineRule="auto"/>
+        <w:spacing w:after="0" w:line="240" w:lineRule="auto"/>
         <w:jc w:val="center"/>
       </w:pPr>
       <w:r>
         <w:rPr>
           <w:rFonts w:ascii="Times New Roman" w:hAnsi="Times New Roman" w:eastAsia="Times New Roman"/>
           <w:b/>
-          <w:color w:val="000000"/>
           <w:sz w:val="32"/>
           <w:u w:val="none"/>
         </w:rPr>
@@ -22,17 +19,14 @@
     </w:p>
     <w:p>
       <w:pPr>
-        <w:keepNext w:val="0"/>
-        <w:widowControl/>
-        <w:spacing w:before="0" w:after="0" w:line="211" w:lineRule="auto"/>
+        <w:spacing w:after="0" w:line="240" w:lineRule="auto"/>
         <w:jc w:val="center"/>
       </w:pPr>
       <w:r>
         <w:rPr>
           <w:rFonts w:ascii="Times New Roman" w:hAnsi="Times New Roman" w:eastAsia="Times New Roman"/>
           <w:b w:val="0"/>
-          <w:color w:val="000000"/>
-          <w:sz w:val="18"/>
+          <w:sz w:val="20"/>
           <w:u w:val="none"/>
         </w:rPr>
         <w:t xml:space="preserve">411 Mill Street, Worcester, MA 01602  |  </w:t>
@@ -40,9 +34,10 @@
       <w:hyperlink r:id="rId8">
         <w:r>
           <w:rPr>
-            <w:rFonts w:ascii="Times New Roman" w:hAnsi="Times New Roman"/>
-            <w:color w:val="000000"/>
-            <w:sz w:val="18"/>
+            <w:rFonts w:ascii="Times New Roman" w:hAnsi="Times New Roman" w:eastAsia="Times New Roman"/>
+            <w:b w:val="0"/>
+            <w:sz w:val="20"/>
+            <w:u w:val="none"/>
           </w:rPr>
           <w:t>yhassan@worcester.edu</w:t>
         </w:r>
@@ -51,8 +46,7 @@
         <w:rPr>
           <w:rFonts w:ascii="Times New Roman" w:hAnsi="Times New Roman" w:eastAsia="Times New Roman"/>
           <w:b w:val="0"/>
-          <w:color w:val="000000"/>
-          <w:sz w:val="18"/>
+          <w:sz w:val="20"/>
           <w:u w:val="none"/>
         </w:rPr>
         <w:t xml:space="preserve">  |  </w:t>
@@ -60,9 +54,10 @@
       <w:hyperlink r:id="rId9">
         <w:r>
           <w:rPr>
-            <w:rFonts w:ascii="Times New Roman" w:hAnsi="Times New Roman"/>
-            <w:color w:val="000000"/>
-            <w:sz w:val="18"/>
+            <w:rFonts w:ascii="Times New Roman" w:hAnsi="Times New Roman" w:eastAsia="Times New Roman"/>
+            <w:b w:val="0"/>
+            <w:sz w:val="20"/>
+            <w:u w:val="none"/>
           </w:rPr>
           <w:t>github.com/YousefHassan123</w:t>
         </w:r>
@@ -70,17 +65,16 @@
     </w:p>
     <w:p>
       <w:pPr>
-        <w:keepNext w:val="0"/>
-        <w:widowControl/>
-        <w:spacing w:before="0" w:after="0" w:line="211" w:lineRule="auto"/>
+        <w:spacing w:after="0" w:line="240" w:lineRule="auto"/>
         <w:jc w:val="center"/>
       </w:pPr>
       <w:hyperlink r:id="rId10">
         <w:r>
           <w:rPr>
-            <w:rFonts w:ascii="Times New Roman" w:hAnsi="Times New Roman"/>
-            <w:color w:val="000000"/>
-            <w:sz w:val="18"/>
+            <w:rFonts w:ascii="Times New Roman" w:hAnsi="Times New Roman" w:eastAsia="Times New Roman"/>
+            <w:b w:val="0"/>
+            <w:sz w:val="20"/>
+            <w:u w:val="none"/>
           </w:rPr>
           <w:t>yousefalihassan.com</w:t>
         </w:r>
@@ -88,16 +82,18 @@
     </w:p>
     <w:p>
       <w:pPr>
-        <w:keepNext/>
-        <w:widowControl/>
-        <w:spacing w:before="84" w:after="16" w:line="228" w:lineRule="auto"/>
+        <w:spacing w:after="0" w:line="240" w:lineRule="auto"/>
+      </w:pPr>
+    </w:p>
+    <w:p>
+      <w:pPr>
+        <w:spacing w:after="0" w:line="240" w:lineRule="auto"/>
       </w:pPr>
       <w:r>
         <w:rPr>
           <w:rFonts w:ascii="Times New Roman" w:hAnsi="Times New Roman" w:eastAsia="Times New Roman"/>
           <w:b/>
-          <w:color w:val="000000"/>
-          <w:sz w:val="22"/>
+          <w:sz w:val="24"/>
           <w:u w:val="single"/>
         </w:rPr>
         <w:t>OBJECTIVE</w:t>
@@ -105,33 +101,32 @@
     </w:p>
     <w:p>
       <w:pPr>
-        <w:keepNext w:val="0"/>
-        <w:widowControl/>
-        <w:spacing w:before="0" w:after="0" w:line="230" w:lineRule="auto"/>
-      </w:pPr>
-      <w:r>
-        <w:rPr>
-          <w:rFonts w:ascii="Times New Roman" w:hAnsi="Times New Roman" w:eastAsia="Times New Roman"/>
-          <w:b w:val="0"/>
-          <w:color w:val="000000"/>
-          <w:sz w:val="18"/>
-          <w:u w:val="none"/>
-        </w:rPr>
-        <w:t>Computer Science graduate with full-stack project experience across TypeScript, Python, PostgreSQL, Linux, API testing, data analysis, and distributed systems.</w:t>
-      </w:r>
-    </w:p>
-    <w:p>
-      <w:pPr>
-        <w:keepNext/>
-        <w:widowControl/>
-        <w:spacing w:before="84" w:after="16" w:line="228" w:lineRule="auto"/>
+        <w:spacing w:after="0" w:line="240" w:lineRule="auto"/>
+      </w:pPr>
+      <w:r>
+        <w:rPr>
+          <w:rFonts w:ascii="Times New Roman" w:hAnsi="Times New Roman" w:eastAsia="Times New Roman"/>
+          <w:b w:val="0"/>
+          <w:sz w:val="20"/>
+          <w:u w:val="none"/>
+        </w:rPr>
+        <w:t>Computer Science graduate with practical software, data, and systems project experience using Python, C/C++, SQL, Linux/Unix, REST APIs, and clear technical documentation.</w:t>
+      </w:r>
+    </w:p>
+    <w:p>
+      <w:pPr>
+        <w:spacing w:after="0" w:line="240" w:lineRule="auto"/>
+      </w:pPr>
+    </w:p>
+    <w:p>
+      <w:pPr>
+        <w:spacing w:after="0" w:line="240" w:lineRule="auto"/>
       </w:pPr>
       <w:r>
         <w:rPr>
           <w:rFonts w:ascii="Times New Roman" w:hAnsi="Times New Roman" w:eastAsia="Times New Roman"/>
           <w:b/>
-          <w:color w:val="000000"/>
-          <w:sz w:val="22"/>
+          <w:sz w:val="24"/>
           <w:u w:val="single"/>
         </w:rPr>
         <w:t>EDUCATION</w:t>
@@ -139,19 +134,16 @@
     </w:p>
     <w:p>
       <w:pPr>
-        <w:keepNext/>
-        <w:widowControl/>
         <w:tabs>
-          <w:tab w:pos="10872" w:val="right"/>
+          <w:tab w:pos="10080" w:val="right"/>
         </w:tabs>
-        <w:spacing w:before="0" w:after="0" w:line="228" w:lineRule="auto"/>
+        <w:spacing w:after="0" w:line="240" w:lineRule="auto"/>
       </w:pPr>
       <w:r>
         <w:rPr>
           <w:rFonts w:ascii="Times New Roman" w:hAnsi="Times New Roman" w:eastAsia="Times New Roman"/>
           <w:b/>
-          <w:color w:val="000000"/>
-          <w:sz w:val="18"/>
+          <w:sz w:val="20"/>
           <w:u w:val="none"/>
         </w:rPr>
         <w:t>Worcester State University</w:t>
@@ -160,8 +152,7 @@
         <w:rPr>
           <w:rFonts w:ascii="Times New Roman" w:hAnsi="Times New Roman" w:eastAsia="Times New Roman"/>
           <w:b w:val="0"/>
-          <w:color w:val="000000"/>
-          <w:sz w:val="18"/>
+          <w:sz w:val="20"/>
           <w:u w:val="none"/>
         </w:rPr>
         <w:tab/>
@@ -170,19 +161,16 @@
     </w:p>
     <w:p>
       <w:pPr>
-        <w:keepNext/>
-        <w:widowControl/>
         <w:tabs>
-          <w:tab w:pos="10872" w:val="right"/>
+          <w:tab w:pos="10080" w:val="right"/>
         </w:tabs>
-        <w:spacing w:before="0" w:after="0" w:line="228" w:lineRule="auto"/>
-      </w:pPr>
-      <w:r>
-        <w:rPr>
-          <w:rFonts w:ascii="Times New Roman" w:hAnsi="Times New Roman" w:eastAsia="Times New Roman"/>
-          <w:b w:val="0"/>
-          <w:color w:val="000000"/>
-          <w:sz w:val="18"/>
+        <w:spacing w:after="0" w:line="240" w:lineRule="auto"/>
+      </w:pPr>
+      <w:r>
+        <w:rPr>
+          <w:rFonts w:ascii="Times New Roman" w:hAnsi="Times New Roman" w:eastAsia="Times New Roman"/>
+          <w:b w:val="0"/>
+          <w:sz w:val="20"/>
           <w:u w:val="none"/>
         </w:rPr>
         <w:t>B.S. Computer Science; Minor in Physics; GPA: 3.06</w:t>
@@ -191,8 +179,7 @@
         <w:rPr>
           <w:rFonts w:ascii="Times New Roman" w:hAnsi="Times New Roman" w:eastAsia="Times New Roman"/>
           <w:b w:val="0"/>
-          <w:color w:val="000000"/>
-          <w:sz w:val="18"/>
+          <w:sz w:val="20"/>
           <w:u w:val="none"/>
         </w:rPr>
         <w:tab/>
@@ -201,16 +188,18 @@
     </w:p>
     <w:p>
       <w:pPr>
-        <w:keepNext/>
-        <w:widowControl/>
-        <w:spacing w:before="84" w:after="16" w:line="228" w:lineRule="auto"/>
+        <w:spacing w:after="0" w:line="240" w:lineRule="auto"/>
+      </w:pPr>
+    </w:p>
+    <w:p>
+      <w:pPr>
+        <w:spacing w:after="0" w:line="240" w:lineRule="auto"/>
       </w:pPr>
       <w:r>
         <w:rPr>
           <w:rFonts w:ascii="Times New Roman" w:hAnsi="Times New Roman" w:eastAsia="Times New Roman"/>
           <w:b/>
-          <w:color w:val="000000"/>
-          <w:sz w:val="22"/>
+          <w:sz w:val="24"/>
           <w:u w:val="single"/>
         </w:rPr>
         <w:t>CLASS PROJECT EXPERIENCE</w:t>
@@ -218,29 +207,134 @@
     </w:p>
     <w:p>
       <w:pPr>
-        <w:keepNext/>
-        <w:widowControl/>
         <w:tabs>
-          <w:tab w:pos="10872" w:val="right"/>
+          <w:tab w:pos="10080" w:val="right"/>
         </w:tabs>
-        <w:spacing w:before="0" w:after="0" w:line="228" w:lineRule="auto"/>
-      </w:pPr>
-      <w:r>
-        <w:rPr>
-          <w:rFonts w:ascii="Times New Roman" w:hAnsi="Times New Roman" w:eastAsia="Times New Roman"/>
-          <w:b/>
-          <w:color w:val="000000"/>
-          <w:sz w:val="18"/>
-          <w:u w:val="none"/>
-        </w:rPr>
-        <w:t>CircuitNorth Commerce</w:t>
-      </w:r>
-      <w:r>
-        <w:rPr>
-          <w:rFonts w:ascii="Times New Roman" w:hAnsi="Times New Roman" w:eastAsia="Times New Roman"/>
-          <w:b w:val="0"/>
-          <w:color w:val="000000"/>
-          <w:sz w:val="18"/>
+        <w:spacing w:after="0" w:line="240" w:lineRule="auto"/>
+      </w:pPr>
+      <w:hyperlink r:id="rId11" w:tooltip="Open project link">
+        <w:r>
+          <w:rPr>
+            <w:rFonts w:ascii="Times New Roman" w:hAnsi="Times New Roman" w:eastAsia="Times New Roman"/>
+            <w:b/>
+            <w:sz w:val="20"/>
+            <w:u w:val="none"/>
+          </w:rPr>
+          <w:t>REST API Testing Suite</w:t>
+        </w:r>
+      </w:hyperlink>
+      <w:r>
+        <w:rPr>
+          <w:rFonts w:ascii="Times New Roman" w:hAnsi="Times New Roman" w:eastAsia="Times New Roman"/>
+          <w:b w:val="0"/>
+          <w:sz w:val="20"/>
+          <w:u w:val="none"/>
+        </w:rPr>
+        <w:tab/>
+        <w:t>2025</w:t>
+      </w:r>
+    </w:p>
+    <w:p>
+      <w:pPr>
+        <w:spacing w:after="0" w:line="240" w:lineRule="auto"/>
+      </w:pPr>
+      <w:r>
+        <w:rPr>
+          <w:rFonts w:ascii="Times New Roman" w:hAnsi="Times New Roman" w:eastAsia="Times New Roman"/>
+          <w:b w:val="0"/>
+          <w:sz w:val="20"/>
+          <w:u w:val="none"/>
+        </w:rPr>
+        <w:t>HTTP / API Design</w:t>
+      </w:r>
+    </w:p>
+    <w:p>
+      <w:pPr>
+        <w:pStyle w:val="ListParagraph"/>
+        <w:spacing w:after="0" w:line="240" w:lineRule="auto"/>
+        <w:ind w:left="331" w:hanging="187"/>
+      </w:pPr>
+      <w:r>
+        <w:rPr>
+          <w:rFonts w:ascii="Times New Roman" w:hAnsi="Times New Roman" w:eastAsia="Times New Roman"/>
+          <w:b w:val="0"/>
+          <w:sz w:val="19"/>
+          <w:u w:val="none"/>
+        </w:rPr>
+        <w:t>Designed manual test cases for POST, PUT, and DELETE guest workflows, covering success paths and 400, 404, and 409 responses.</w:t>
+      </w:r>
+    </w:p>
+    <w:p>
+      <w:pPr>
+        <w:pStyle w:val="ListParagraph"/>
+        <w:spacing w:after="0" w:line="240" w:lineRule="auto"/>
+        <w:ind w:left="331" w:hanging="187"/>
+      </w:pPr>
+      <w:r>
+        <w:rPr>
+          <w:rFonts w:ascii="Times New Roman" w:hAnsi="Times New Roman" w:eastAsia="Times New Roman"/>
+          <w:b w:val="0"/>
+          <w:sz w:val="19"/>
+          <w:u w:val="none"/>
+        </w:rPr>
+        <w:t>Built request documentation for validation, duplicate-record checks, endpoint behavior, and automated API test planning.</w:t>
+      </w:r>
+    </w:p>
+    <w:p>
+      <w:pPr>
+        <w:pStyle w:val="ListParagraph"/>
+        <w:spacing w:after="0" w:line="240" w:lineRule="auto"/>
+        <w:ind w:left="331" w:hanging="187"/>
+      </w:pPr>
+      <w:r>
+        <w:rPr>
+          <w:rFonts w:ascii="Times New Roman" w:hAnsi="Times New Roman" w:eastAsia="Times New Roman"/>
+          <w:b w:val="0"/>
+          <w:sz w:val="19"/>
+          <w:u w:val="none"/>
+        </w:rPr>
+        <w:t>Organized expected inputs, request payloads, edge cases, and response outcomes into repeatable QA notes.</w:t>
+      </w:r>
+    </w:p>
+    <w:p>
+      <w:pPr>
+        <w:pStyle w:val="ListParagraph"/>
+        <w:spacing w:after="0" w:line="240" w:lineRule="auto"/>
+        <w:ind w:left="331" w:hanging="187"/>
+      </w:pPr>
+      <w:r>
+        <w:rPr>
+          <w:rFonts w:ascii="Times New Roman" w:hAnsi="Times New Roman" w:eastAsia="Times New Roman"/>
+          <w:b w:val="0"/>
+          <w:sz w:val="19"/>
+          <w:u w:val="none"/>
+        </w:rPr>
+        <w:t>Documented sample request bodies, expected status codes, and tester notes so API behavior was reviewed consistently.</w:t>
+      </w:r>
+    </w:p>
+    <w:p>
+      <w:pPr>
+        <w:tabs>
+          <w:tab w:pos="10080" w:val="right"/>
+        </w:tabs>
+        <w:spacing w:after="0" w:line="240" w:lineRule="auto"/>
+      </w:pPr>
+      <w:hyperlink r:id="rId12" w:tooltip="Open project link">
+        <w:r>
+          <w:rPr>
+            <w:rFonts w:ascii="Times New Roman" w:hAnsi="Times New Roman" w:eastAsia="Times New Roman"/>
+            <w:b/>
+            <w:sz w:val="20"/>
+            <w:u w:val="none"/>
+          </w:rPr>
+          <w:t>Data Analytics Dashboard</w:t>
+        </w:r>
+      </w:hyperlink>
+      <w:r>
+        <w:rPr>
+          <w:rFonts w:ascii="Times New Roman" w:hAnsi="Times New Roman" w:eastAsia="Times New Roman"/>
+          <w:b w:val="0"/>
+          <w:sz w:val="20"/>
           <w:u w:val="none"/>
         </w:rPr>
         <w:tab/>
@@ -249,112 +343,105 @@
     </w:p>
     <w:p>
       <w:pPr>
-        <w:keepNext/>
-        <w:widowControl/>
-        <w:spacing w:before="0" w:after="0" w:line="223" w:lineRule="auto"/>
-      </w:pPr>
-      <w:r>
-        <w:rPr>
-          <w:rFonts w:ascii="Times New Roman" w:hAnsi="Times New Roman" w:eastAsia="Times New Roman"/>
-          <w:b w:val="0"/>
-          <w:color w:val="000000"/>
-          <w:sz w:val="18"/>
-          <w:u w:val="none"/>
-        </w:rPr>
-        <w:t>Next.js / TypeScript / PostgreSQL / Supabase</w:t>
-      </w:r>
-    </w:p>
-    <w:p>
-      <w:pPr>
-        <w:keepNext/>
-        <w:widowControl/>
-        <w:spacing w:before="0" w:after="0" w:line="230" w:lineRule="auto"/>
+        <w:spacing w:after="0" w:line="240" w:lineRule="auto"/>
+      </w:pPr>
+      <w:r>
+        <w:rPr>
+          <w:rFonts w:ascii="Times New Roman" w:hAnsi="Times New Roman" w:eastAsia="Times New Roman"/>
+          <w:b w:val="0"/>
+          <w:sz w:val="20"/>
+          <w:u w:val="none"/>
+        </w:rPr>
+        <w:t>Python / SQL / Data Visualization</w:t>
+      </w:r>
+    </w:p>
+    <w:p>
+      <w:pPr>
+        <w:pStyle w:val="ListParagraph"/>
+        <w:spacing w:after="0" w:line="240" w:lineRule="auto"/>
         <w:ind w:left="331" w:hanging="187"/>
-        <w:numPr>
-          <w:ilvl w:val="0"/>
-          <w:numId w:val="9"/>
-        </w:numPr>
-      </w:pPr>
-      <w:r>
-        <w:rPr>
-          <w:rFonts w:ascii="Times New Roman" w:hAnsi="Times New Roman" w:eastAsia="Times New Roman"/>
-          <w:b w:val="0"/>
-          <w:color w:val="000000"/>
-          <w:sz w:val="18"/>
-          <w:u w:val="none"/>
-        </w:rPr>
-        <w:t>Built a responsive technology storefront with catalog search and filters, product variants, persistent cart, demo checkout, customer orders, cancellation, and account workflows.</w:t>
-      </w:r>
-    </w:p>
-    <w:p>
-      <w:pPr>
-        <w:keepNext/>
-        <w:widowControl/>
-        <w:spacing w:before="0" w:after="0" w:line="230" w:lineRule="auto"/>
+      </w:pPr>
+      <w:r>
+        <w:rPr>
+          <w:rFonts w:ascii="Times New Roman" w:hAnsi="Times New Roman" w:eastAsia="Times New Roman"/>
+          <w:b w:val="0"/>
+          <w:sz w:val="19"/>
+          <w:u w:val="none"/>
+        </w:rPr>
+        <w:t>Built a Python and SQL dashboard for cleaning a dataset, writing queries, generating summary metrics, and presenting trends in a simple web interface.</w:t>
+      </w:r>
+    </w:p>
+    <w:p>
+      <w:pPr>
+        <w:pStyle w:val="ListParagraph"/>
+        <w:spacing w:after="0" w:line="240" w:lineRule="auto"/>
         <w:ind w:left="331" w:hanging="187"/>
-        <w:numPr>
-          <w:ilvl w:val="0"/>
-          <w:numId w:val="9"/>
-        </w:numPr>
-      </w:pPr>
-      <w:r>
-        <w:rPr>
-          <w:rFonts w:ascii="Times New Roman" w:hAnsi="Times New Roman" w:eastAsia="Times New Roman"/>
-          <w:b w:val="0"/>
-          <w:color w:val="000000"/>
-          <w:sz w:val="18"/>
-          <w:u w:val="none"/>
-        </w:rPr>
-        <w:t>Created a role-based operations console for product, category, variant, inventory, discount, customer, fulfillment, refund, CSV report, and audit workflows.</w:t>
-      </w:r>
-    </w:p>
-    <w:p>
-      <w:pPr>
-        <w:keepNext w:val="0"/>
-        <w:widowControl/>
-        <w:spacing w:before="0" w:after="24" w:line="230" w:lineRule="auto"/>
+      </w:pPr>
+      <w:r>
+        <w:rPr>
+          <w:rFonts w:ascii="Times New Roman" w:hAnsi="Times New Roman" w:eastAsia="Times New Roman"/>
+          <w:b w:val="0"/>
+          <w:sz w:val="19"/>
+          <w:u w:val="none"/>
+        </w:rPr>
+        <w:t>Applied data mining, probability/statistics, databases, and capstone coursework to a documented analytics workflow.</w:t>
+      </w:r>
+    </w:p>
+    <w:p>
+      <w:pPr>
+        <w:pStyle w:val="ListParagraph"/>
+        <w:spacing w:after="0" w:line="240" w:lineRule="auto"/>
         <w:ind w:left="331" w:hanging="187"/>
-        <w:numPr>
-          <w:ilvl w:val="0"/>
-          <w:numId w:val="9"/>
-        </w:numPr>
-      </w:pPr>
-      <w:r>
-        <w:rPr>
-          <w:rFonts w:ascii="Times New Roman" w:hAnsi="Times New Roman" w:eastAsia="Times New Roman"/>
-          <w:b w:val="0"/>
-          <w:color w:val="000000"/>
-          <w:sz w:val="18"/>
-          <w:u w:val="none"/>
-        </w:rPr>
-        <w:t>Designed versioned Zod-validated APIs, Supabase RLS, and transactional stock functions; passed 9 Vitest and 10 Playwright desktop/mobile tests plus strict TypeScript, ESLint, accessibility, and production-build checks.</w:t>
-      </w:r>
-    </w:p>
-    <w:p>
-      <w:pPr>
-        <w:keepNext/>
-        <w:widowControl/>
+      </w:pPr>
+      <w:r>
+        <w:rPr>
+          <w:rFonts w:ascii="Times New Roman" w:hAnsi="Times New Roman" w:eastAsia="Times New Roman"/>
+          <w:b w:val="0"/>
+          <w:sz w:val="19"/>
+          <w:u w:val="none"/>
+        </w:rPr>
+        <w:t>Prepared charts, calculated key metrics, and structured findings so non-technical users could scan results quickly.</w:t>
+      </w:r>
+    </w:p>
+    <w:p>
+      <w:pPr>
+        <w:pStyle w:val="ListParagraph"/>
+        <w:spacing w:after="0" w:line="240" w:lineRule="auto"/>
+        <w:ind w:left="331" w:hanging="187"/>
+      </w:pPr>
+      <w:r>
+        <w:rPr>
+          <w:rFonts w:ascii="Times New Roman" w:hAnsi="Times New Roman" w:eastAsia="Times New Roman"/>
+          <w:b w:val="0"/>
+          <w:sz w:val="19"/>
+          <w:u w:val="none"/>
+        </w:rPr>
+        <w:t>Compared cleaned outputs against summary calculations to catch inconsistent values before final visualization.</w:t>
+      </w:r>
+    </w:p>
+    <w:p>
+      <w:pPr>
         <w:tabs>
-          <w:tab w:pos="10872" w:val="right"/>
+          <w:tab w:pos="10080" w:val="right"/>
         </w:tabs>
-        <w:spacing w:before="0" w:after="0" w:line="228" w:lineRule="auto"/>
-      </w:pPr>
-      <w:r>
-        <w:rPr>
-          <w:rFonts w:ascii="Times New Roman" w:hAnsi="Times New Roman" w:eastAsia="Times New Roman"/>
-          <w:b/>
-          <w:color w:val="000000"/>
-          <w:sz w:val="18"/>
-          <w:u w:val="none"/>
-        </w:rPr>
-        <w:t>Retail API Contract Tests</w:t>
-      </w:r>
-      <w:r>
-        <w:rPr>
-          <w:rFonts w:ascii="Times New Roman" w:hAnsi="Times New Roman" w:eastAsia="Times New Roman"/>
-          <w:b w:val="0"/>
-          <w:color w:val="000000"/>
-          <w:sz w:val="18"/>
+        <w:spacing w:after="0" w:line="240" w:lineRule="auto"/>
+      </w:pPr>
+      <w:hyperlink r:id="rId13" w:tooltip="Open project link">
+        <w:r>
+          <w:rPr>
+            <w:rFonts w:ascii="Times New Roman" w:hAnsi="Times New Roman" w:eastAsia="Times New Roman"/>
+            <w:b/>
+            <w:sz w:val="20"/>
+            <w:u w:val="none"/>
+          </w:rPr>
+          <w:t>Linux Systems Toolkit</w:t>
+        </w:r>
+      </w:hyperlink>
+      <w:r>
+        <w:rPr>
+          <w:rFonts w:ascii="Times New Roman" w:hAnsi="Times New Roman" w:eastAsia="Times New Roman"/>
+          <w:b w:val="0"/>
+          <w:sz w:val="20"/>
           <w:u w:val="none"/>
         </w:rPr>
         <w:tab/>
@@ -363,90 +450,105 @@
     </w:p>
     <w:p>
       <w:pPr>
-        <w:keepNext/>
-        <w:widowControl/>
-        <w:spacing w:before="0" w:after="0" w:line="223" w:lineRule="auto"/>
-      </w:pPr>
-      <w:r>
-        <w:rPr>
-          <w:rFonts w:ascii="Times New Roman" w:hAnsi="Times New Roman" w:eastAsia="Times New Roman"/>
-          <w:b w:val="0"/>
-          <w:color w:val="000000"/>
-          <w:sz w:val="18"/>
-          <w:u w:val="none"/>
-        </w:rPr>
-        <w:t>Python / pytest / HTTPX / JSON Schema</w:t>
-      </w:r>
-    </w:p>
-    <w:p>
-      <w:pPr>
-        <w:keepNext/>
-        <w:widowControl/>
-        <w:spacing w:before="0" w:after="0" w:line="230" w:lineRule="auto"/>
+        <w:spacing w:after="0" w:line="240" w:lineRule="auto"/>
+      </w:pPr>
+      <w:r>
+        <w:rPr>
+          <w:rFonts w:ascii="Times New Roman" w:hAnsi="Times New Roman" w:eastAsia="Times New Roman"/>
+          <w:b w:val="0"/>
+          <w:sz w:val="20"/>
+          <w:u w:val="none"/>
+        </w:rPr>
+        <w:t>Bash / UNIX Systems Programming</w:t>
+      </w:r>
+    </w:p>
+    <w:p>
+      <w:pPr>
+        <w:pStyle w:val="ListParagraph"/>
+        <w:spacing w:after="0" w:line="240" w:lineRule="auto"/>
         <w:ind w:left="331" w:hanging="187"/>
-        <w:numPr>
-          <w:ilvl w:val="0"/>
-          <w:numId w:val="9"/>
-        </w:numPr>
-      </w:pPr>
-      <w:r>
-        <w:rPr>
-          <w:rFonts w:ascii="Times New Roman" w:hAnsi="Times New Roman" w:eastAsia="Times New Roman"/>
-          <w:b w:val="0"/>
-          <w:color w:val="000000"/>
-          <w:sz w:val="18"/>
-          <w:u w:val="none"/>
-        </w:rPr>
-        <w:t>Automated CircuitNorth API contracts for successful requests, validation errors, role denial, conflicts, missing resources, required headers, and response schemas.</w:t>
-      </w:r>
-    </w:p>
-    <w:p>
-      <w:pPr>
-        <w:keepNext w:val="0"/>
-        <w:widowControl/>
-        <w:spacing w:before="0" w:after="24" w:line="230" w:lineRule="auto"/>
+      </w:pPr>
+      <w:r>
+        <w:rPr>
+          <w:rFonts w:ascii="Times New Roman" w:hAnsi="Times New Roman" w:eastAsia="Times New Roman"/>
+          <w:b w:val="0"/>
+          <w:sz w:val="19"/>
+          <w:u w:val="none"/>
+        </w:rPr>
+        <w:t>Created Bash utilities for log parsing, file checks, permissions review, process monitoring, and repeatable command-line workflows.</w:t>
+      </w:r>
+    </w:p>
+    <w:p>
+      <w:pPr>
+        <w:pStyle w:val="ListParagraph"/>
+        <w:spacing w:after="0" w:line="240" w:lineRule="auto"/>
         <w:ind w:left="331" w:hanging="187"/>
-        <w:numPr>
-          <w:ilvl w:val="0"/>
-          <w:numId w:val="9"/>
-        </w:numPr>
-      </w:pPr>
-      <w:r>
-        <w:rPr>
-          <w:rFonts w:ascii="Times New Roman" w:hAnsi="Times New Roman" w:eastAsia="Times New Roman"/>
-          <w:b w:val="0"/>
-          <w:color w:val="000000"/>
-          <w:sz w:val="18"/>
-          <w:u w:val="none"/>
-        </w:rPr>
-        <w:t>Passed 7 isolated MockTransport tests at 90% coverage and 3 live integration tests against the running Next.js API.</w:t>
-      </w:r>
-    </w:p>
-    <w:p>
-      <w:pPr>
-        <w:keepNext/>
-        <w:widowControl/>
+      </w:pPr>
+      <w:r>
+        <w:rPr>
+          <w:rFonts w:ascii="Times New Roman" w:hAnsi="Times New Roman" w:eastAsia="Times New Roman"/>
+          <w:b w:val="0"/>
+          <w:sz w:val="19"/>
+          <w:u w:val="none"/>
+        </w:rPr>
+        <w:t>Documented each script with command examples to show Linux fundamentals, troubleshooting steps, and clean technical communication.</w:t>
+      </w:r>
+    </w:p>
+    <w:p>
+      <w:pPr>
+        <w:pStyle w:val="ListParagraph"/>
+        <w:spacing w:after="0" w:line="240" w:lineRule="auto"/>
+        <w:ind w:left="331" w:hanging="187"/>
+      </w:pPr>
+      <w:r>
+        <w:rPr>
+          <w:rFonts w:ascii="Times New Roman" w:hAnsi="Times New Roman" w:eastAsia="Times New Roman"/>
+          <w:b w:val="0"/>
+          <w:sz w:val="19"/>
+          <w:u w:val="none"/>
+        </w:rPr>
+        <w:t>Used UNIX systems programming concepts to make routine terminal tasks easier to test, explain, and repeat.</w:t>
+      </w:r>
+    </w:p>
+    <w:p>
+      <w:pPr>
+        <w:pStyle w:val="ListParagraph"/>
+        <w:spacing w:after="0" w:line="240" w:lineRule="auto"/>
+        <w:ind w:left="331" w:hanging="187"/>
+      </w:pPr>
+      <w:r>
+        <w:rPr>
+          <w:rFonts w:ascii="Times New Roman" w:hAnsi="Times New Roman" w:eastAsia="Times New Roman"/>
+          <w:b w:val="0"/>
+          <w:sz w:val="19"/>
+          <w:u w:val="none"/>
+        </w:rPr>
+        <w:t>Combined command-line flags, file-system checks, and script comments to support maintainable troubleshooting.</w:t>
+      </w:r>
+    </w:p>
+    <w:p>
+      <w:pPr>
         <w:tabs>
-          <w:tab w:pos="10872" w:val="right"/>
+          <w:tab w:pos="10080" w:val="right"/>
         </w:tabs>
-        <w:spacing w:before="0" w:after="0" w:line="228" w:lineRule="auto"/>
-      </w:pPr>
-      <w:r>
-        <w:rPr>
-          <w:rFonts w:ascii="Times New Roman" w:hAnsi="Times New Roman" w:eastAsia="Times New Roman"/>
-          <w:b/>
-          <w:color w:val="000000"/>
-          <w:sz w:val="18"/>
-          <w:u w:val="none"/>
-        </w:rPr>
-        <w:t>Retail Analytics Dashboard</w:t>
-      </w:r>
-      <w:r>
-        <w:rPr>
-          <w:rFonts w:ascii="Times New Roman" w:hAnsi="Times New Roman" w:eastAsia="Times New Roman"/>
-          <w:b w:val="0"/>
-          <w:color w:val="000000"/>
-          <w:sz w:val="18"/>
+        <w:spacing w:after="0" w:line="240" w:lineRule="auto"/>
+      </w:pPr>
+      <w:hyperlink r:id="rId14" w:tooltip="Open project link">
+        <w:r>
+          <w:rPr>
+            <w:rFonts w:ascii="Times New Roman" w:hAnsi="Times New Roman" w:eastAsia="Times New Roman"/>
+            <w:b/>
+            <w:sz w:val="20"/>
+            <w:u w:val="none"/>
+          </w:rPr>
+          <w:t>Database Design &amp; Reporting Lab</w:t>
+        </w:r>
+      </w:hyperlink>
+      <w:r>
+        <w:rPr>
+          <w:rFonts w:ascii="Times New Roman" w:hAnsi="Times New Roman" w:eastAsia="Times New Roman"/>
+          <w:b w:val="0"/>
+          <w:sz w:val="20"/>
           <w:u w:val="none"/>
         </w:rPr>
         <w:tab/>
@@ -455,90 +557,105 @@
     </w:p>
     <w:p>
       <w:pPr>
-        <w:keepNext/>
-        <w:widowControl/>
-        <w:spacing w:before="0" w:after="0" w:line="223" w:lineRule="auto"/>
-      </w:pPr>
-      <w:r>
-        <w:rPr>
-          <w:rFonts w:ascii="Times New Roman" w:hAnsi="Times New Roman" w:eastAsia="Times New Roman"/>
-          <w:b w:val="0"/>
-          <w:color w:val="000000"/>
-          <w:sz w:val="18"/>
-          <w:u w:val="none"/>
-        </w:rPr>
-        <w:t>Python / pandas / Streamlit / Plotly</w:t>
-      </w:r>
-    </w:p>
-    <w:p>
-      <w:pPr>
-        <w:keepNext/>
-        <w:widowControl/>
-        <w:spacing w:before="0" w:after="0" w:line="230" w:lineRule="auto"/>
+        <w:spacing w:after="0" w:line="240" w:lineRule="auto"/>
+      </w:pPr>
+      <w:r>
+        <w:rPr>
+          <w:rFonts w:ascii="Times New Roman" w:hAnsi="Times New Roman" w:eastAsia="Times New Roman"/>
+          <w:b w:val="0"/>
+          <w:sz w:val="20"/>
+          <w:u w:val="none"/>
+        </w:rPr>
+        <w:t>SQL / Schema Design</w:t>
+      </w:r>
+    </w:p>
+    <w:p>
+      <w:pPr>
+        <w:pStyle w:val="ListParagraph"/>
+        <w:spacing w:after="0" w:line="240" w:lineRule="auto"/>
         <w:ind w:left="331" w:hanging="187"/>
-        <w:numPr>
-          <w:ilvl w:val="0"/>
-          <w:numId w:val="9"/>
-        </w:numPr>
-      </w:pPr>
-      <w:r>
-        <w:rPr>
-          <w:rFonts w:ascii="Times New Roman" w:hAnsi="Times New Roman" w:eastAsia="Times New Roman"/>
-          <w:b w:val="0"/>
-          <w:color w:val="000000"/>
-          <w:sz w:val="18"/>
-          <w:u w:val="none"/>
-        </w:rPr>
-        <w:t>Built an interactive dashboard that removes duplicate and invalid rows, calculates revenue and order metrics, and analyzes category, customer, daily-sales, and inventory trends.</w:t>
-      </w:r>
-    </w:p>
-    <w:p>
-      <w:pPr>
-        <w:keepNext w:val="0"/>
-        <w:widowControl/>
-        <w:spacing w:before="0" w:after="24" w:line="230" w:lineRule="auto"/>
+      </w:pPr>
+      <w:r>
+        <w:rPr>
+          <w:rFonts w:ascii="Times New Roman" w:hAnsi="Times New Roman" w:eastAsia="Times New Roman"/>
+          <w:b w:val="0"/>
+          <w:sz w:val="19"/>
+          <w:u w:val="none"/>
+        </w:rPr>
+        <w:t>Modeled a small business dataset with normalized tables, ERD notes, seed data, reporting queries, and clear tradeoff documentation.</w:t>
+      </w:r>
+    </w:p>
+    <w:p>
+      <w:pPr>
+        <w:pStyle w:val="ListParagraph"/>
+        <w:spacing w:after="0" w:line="240" w:lineRule="auto"/>
         <w:ind w:left="331" w:hanging="187"/>
-        <w:numPr>
-          <w:ilvl w:val="0"/>
-          <w:numId w:val="9"/>
-        </w:numPr>
-      </w:pPr>
-      <w:r>
-        <w:rPr>
-          <w:rFonts w:ascii="Times New Roman" w:hAnsi="Times New Roman" w:eastAsia="Times New Roman"/>
-          <w:b w:val="0"/>
-          <w:color w:val="000000"/>
-          <w:sz w:val="18"/>
-          <w:u w:val="none"/>
-        </w:rPr>
-        <w:t>Verified cleaning and aggregation logic with 6 pytest tests and 98% package coverage; confirmed the Streamlit service through its runtime health endpoint.</w:t>
-      </w:r>
-    </w:p>
-    <w:p>
-      <w:pPr>
-        <w:keepNext/>
-        <w:widowControl/>
+      </w:pPr>
+      <w:r>
+        <w:rPr>
+          <w:rFonts w:ascii="Times New Roman" w:hAnsi="Times New Roman" w:eastAsia="Times New Roman"/>
+          <w:b w:val="0"/>
+          <w:sz w:val="19"/>
+          <w:u w:val="none"/>
+        </w:rPr>
+        <w:t>Built SQL queries, data quality checks, and practical reporting outputs that show database design beyond classroom exercises.</w:t>
+      </w:r>
+    </w:p>
+    <w:p>
+      <w:pPr>
+        <w:pStyle w:val="ListParagraph"/>
+        <w:spacing w:after="0" w:line="240" w:lineRule="auto"/>
+        <w:ind w:left="331" w:hanging="187"/>
+      </w:pPr>
+      <w:r>
+        <w:rPr>
+          <w:rFonts w:ascii="Times New Roman" w:hAnsi="Times New Roman" w:eastAsia="Times New Roman"/>
+          <w:b w:val="0"/>
+          <w:sz w:val="19"/>
+          <w:u w:val="none"/>
+        </w:rPr>
+        <w:t>Connected schema choices to reporting needs, validation rules, and maintainable data organization.</w:t>
+      </w:r>
+    </w:p>
+    <w:p>
+      <w:pPr>
+        <w:pStyle w:val="ListParagraph"/>
+        <w:spacing w:after="0" w:line="240" w:lineRule="auto"/>
+        <w:ind w:left="331" w:hanging="187"/>
+      </w:pPr>
+      <w:r>
+        <w:rPr>
+          <w:rFonts w:ascii="Times New Roman" w:hAnsi="Times New Roman" w:eastAsia="Times New Roman"/>
+          <w:b w:val="0"/>
+          <w:sz w:val="19"/>
+          <w:u w:val="none"/>
+        </w:rPr>
+        <w:t>Wrote reporting queries for joins, counts, filtered results, and grouped summaries tied to practical business questions.</w:t>
+      </w:r>
+    </w:p>
+    <w:p>
+      <w:pPr>
         <w:tabs>
-          <w:tab w:pos="10872" w:val="right"/>
+          <w:tab w:pos="10080" w:val="right"/>
         </w:tabs>
-        <w:spacing w:before="0" w:after="0" w:line="228" w:lineRule="auto"/>
-      </w:pPr>
-      <w:r>
-        <w:rPr>
-          <w:rFonts w:ascii="Times New Roman" w:hAnsi="Times New Roman" w:eastAsia="Times New Roman"/>
-          <w:b/>
-          <w:color w:val="000000"/>
-          <w:sz w:val="18"/>
-          <w:u w:val="none"/>
-        </w:rPr>
-        <w:t>Linux Systems Toolkit</w:t>
-      </w:r>
-      <w:r>
-        <w:rPr>
-          <w:rFonts w:ascii="Times New Roman" w:hAnsi="Times New Roman" w:eastAsia="Times New Roman"/>
-          <w:b w:val="0"/>
-          <w:color w:val="000000"/>
-          <w:sz w:val="18"/>
+        <w:spacing w:after="0" w:line="240" w:lineRule="auto"/>
+      </w:pPr>
+      <w:hyperlink r:id="rId15" w:tooltip="Open project link">
+        <w:r>
+          <w:rPr>
+            <w:rFonts w:ascii="Times New Roman" w:hAnsi="Times New Roman" w:eastAsia="Times New Roman"/>
+            <w:b/>
+            <w:sz w:val="20"/>
+            <w:u w:val="none"/>
+          </w:rPr>
+          <w:t>Cloud Job Queue Demo</w:t>
+        </w:r>
+      </w:hyperlink>
+      <w:r>
+        <w:rPr>
+          <w:rFonts w:ascii="Times New Roman" w:hAnsi="Times New Roman" w:eastAsia="Times New Roman"/>
+          <w:b w:val="0"/>
+          <w:sz w:val="20"/>
           <w:u w:val="none"/>
         </w:rPr>
         <w:tab/>
@@ -547,274 +664,89 @@
     </w:p>
     <w:p>
       <w:pPr>
-        <w:keepNext/>
-        <w:widowControl/>
-        <w:spacing w:before="0" w:after="0" w:line="223" w:lineRule="auto"/>
-      </w:pPr>
-      <w:r>
-        <w:rPr>
-          <w:rFonts w:ascii="Times New Roman" w:hAnsi="Times New Roman" w:eastAsia="Times New Roman"/>
-          <w:b w:val="0"/>
-          <w:color w:val="000000"/>
-          <w:sz w:val="18"/>
-          <w:u w:val="none"/>
-        </w:rPr>
-        <w:t>Bash / WSL / Bats / ShellCheck</w:t>
-      </w:r>
-    </w:p>
-    <w:p>
-      <w:pPr>
-        <w:keepNext/>
-        <w:widowControl/>
-        <w:spacing w:before="0" w:after="0" w:line="230" w:lineRule="auto"/>
+        <w:spacing w:after="0" w:line="240" w:lineRule="auto"/>
+      </w:pPr>
+      <w:r>
+        <w:rPr>
+          <w:rFonts w:ascii="Times New Roman" w:hAnsi="Times New Roman" w:eastAsia="Times New Roman"/>
+          <w:b w:val="0"/>
+          <w:sz w:val="20"/>
+          <w:u w:val="none"/>
+        </w:rPr>
+        <w:t>Cloud / Distributed Systems</w:t>
+      </w:r>
+    </w:p>
+    <w:p>
+      <w:pPr>
+        <w:pStyle w:val="ListParagraph"/>
+        <w:spacing w:after="0" w:line="240" w:lineRule="auto"/>
         <w:ind w:left="331" w:hanging="187"/>
-        <w:numPr>
-          <w:ilvl w:val="0"/>
-          <w:numId w:val="9"/>
-        </w:numPr>
-      </w:pPr>
-      <w:r>
-        <w:rPr>
-          <w:rFonts w:ascii="Times New Roman" w:hAnsi="Times New Roman" w:eastAsia="Times New Roman"/>
-          <w:b w:val="0"/>
-          <w:color w:val="000000"/>
-          <w:sz w:val="18"/>
-          <w:u w:val="none"/>
-        </w:rPr>
-        <w:t>Created command-line utilities for filtered log summaries, permission audits, process thresholds, disk reports, and file-integrity manifests with machine-readable output.</w:t>
-      </w:r>
-    </w:p>
-    <w:p>
-      <w:pPr>
-        <w:keepNext w:val="0"/>
-        <w:widowControl/>
-        <w:spacing w:before="0" w:after="24" w:line="230" w:lineRule="auto"/>
+      </w:pPr>
+      <w:r>
+        <w:rPr>
+          <w:rFonts w:ascii="Times New Roman" w:hAnsi="Times New Roman" w:eastAsia="Times New Roman"/>
+          <w:b w:val="0"/>
+          <w:sz w:val="19"/>
+          <w:u w:val="none"/>
+        </w:rPr>
+        <w:t>Built a job-submission and worker-processing demo with status tracking, queue flow notes, and deployment documentation.</w:t>
+      </w:r>
+    </w:p>
+    <w:p>
+      <w:pPr>
+        <w:pStyle w:val="ListParagraph"/>
+        <w:spacing w:after="0" w:line="240" w:lineRule="auto"/>
         <w:ind w:left="331" w:hanging="187"/>
-        <w:numPr>
-          <w:ilvl w:val="0"/>
-          <w:numId w:val="9"/>
-        </w:numPr>
-      </w:pPr>
-      <w:r>
-        <w:rPr>
-          <w:rFonts w:ascii="Times New Roman" w:hAnsi="Times New Roman" w:eastAsia="Times New Roman"/>
-          <w:b w:val="0"/>
-          <w:color w:val="000000"/>
-          <w:sz w:val="18"/>
-          <w:u w:val="none"/>
-        </w:rPr>
-        <w:t>Passed ShellCheck and 7 Bats tests in Ubuntu, including invalid-input, changed-file, and threshold-validation cases.</w:t>
-      </w:r>
-    </w:p>
-    <w:p>
-      <w:pPr>
-        <w:keepNext/>
-        <w:widowControl/>
+      </w:pPr>
+      <w:r>
+        <w:rPr>
+          <w:rFonts w:ascii="Times New Roman" w:hAnsi="Times New Roman" w:eastAsia="Times New Roman"/>
+          <w:b w:val="0"/>
+          <w:sz w:val="19"/>
+          <w:u w:val="none"/>
+        </w:rPr>
+        <w:t>Mapped cloud and distributed-computing concepts into task state, failure cases, and system visibility notes.</w:t>
+      </w:r>
+    </w:p>
+    <w:p>
+      <w:pPr>
+        <w:pStyle w:val="ListParagraph"/>
+        <w:spacing w:after="0" w:line="240" w:lineRule="auto"/>
+        <w:ind w:left="331" w:hanging="187"/>
+      </w:pPr>
+      <w:r>
+        <w:rPr>
+          <w:rFonts w:ascii="Times New Roman" w:hAnsi="Times New Roman" w:eastAsia="Times New Roman"/>
+          <w:b w:val="0"/>
+          <w:sz w:val="19"/>
+          <w:u w:val="none"/>
+        </w:rPr>
+        <w:t>Documented queue states such as submitted, processing, completed, and failed to make the workflow easier to inspect.</w:t>
+      </w:r>
+    </w:p>
+    <w:p>
+      <w:pPr>
         <w:tabs>
-          <w:tab w:pos="10872" w:val="right"/>
+          <w:tab w:pos="10080" w:val="right"/>
         </w:tabs>
-        <w:spacing w:before="0" w:after="0" w:line="228" w:lineRule="auto"/>
-      </w:pPr>
-      <w:r>
-        <w:rPr>
-          <w:rFonts w:ascii="Times New Roman" w:hAnsi="Times New Roman" w:eastAsia="Times New Roman"/>
-          <w:b/>
-          <w:color w:val="000000"/>
-          <w:sz w:val="18"/>
-          <w:u w:val="none"/>
-        </w:rPr>
-        <w:t>Retail Database &amp; Reporting Lab</w:t>
-      </w:r>
-      <w:r>
-        <w:rPr>
-          <w:rFonts w:ascii="Times New Roman" w:hAnsi="Times New Roman" w:eastAsia="Times New Roman"/>
-          <w:b w:val="0"/>
-          <w:color w:val="000000"/>
-          <w:sz w:val="18"/>
-          <w:u w:val="none"/>
-        </w:rPr>
-        <w:tab/>
-        <w:t>2026</w:t>
-      </w:r>
-    </w:p>
-    <w:p>
-      <w:pPr>
-        <w:keepNext/>
-        <w:widowControl/>
-        <w:spacing w:before="0" w:after="0" w:line="223" w:lineRule="auto"/>
-      </w:pPr>
-      <w:r>
-        <w:rPr>
-          <w:rFonts w:ascii="Times New Roman" w:hAnsi="Times New Roman" w:eastAsia="Times New Roman"/>
-          <w:b w:val="0"/>
-          <w:color w:val="000000"/>
-          <w:sz w:val="18"/>
-          <w:u w:val="none"/>
-        </w:rPr>
-        <w:t>PostgreSQL / SQL / pgTAP</w:t>
-      </w:r>
-    </w:p>
-    <w:p>
-      <w:pPr>
-        <w:keepNext/>
-        <w:widowControl/>
-        <w:spacing w:before="0" w:after="0" w:line="230" w:lineRule="auto"/>
-        <w:ind w:left="331" w:hanging="187"/>
-        <w:numPr>
-          <w:ilvl w:val="0"/>
-          <w:numId w:val="9"/>
-        </w:numPr>
-      </w:pPr>
-      <w:r>
-        <w:rPr>
-          <w:rFonts w:ascii="Times New Roman" w:hAnsi="Times New Roman" w:eastAsia="Times New Roman"/>
-          <w:b w:val="0"/>
-          <w:color w:val="000000"/>
-          <w:sz w:val="18"/>
-          <w:u w:val="none"/>
-        </w:rPr>
-        <w:t>Designed a normalized retail schema with generated money totals, historical order snapshots, constraints, reporting views, targeted indexes, deterministic seed data, and query-plan examples.</w:t>
-      </w:r>
-    </w:p>
-    <w:p>
-      <w:pPr>
-        <w:keepNext w:val="0"/>
-        <w:widowControl/>
-        <w:spacing w:before="0" w:after="24" w:line="230" w:lineRule="auto"/>
-        <w:ind w:left="331" w:hanging="187"/>
-        <w:numPr>
-          <w:ilvl w:val="0"/>
-          <w:numId w:val="9"/>
-        </w:numPr>
-      </w:pPr>
-      <w:r>
-        <w:rPr>
-          <w:rFonts w:ascii="Times New Roman" w:hAnsi="Times New Roman" w:eastAsia="Times New Roman"/>
-          <w:b w:val="0"/>
-          <w:color w:val="000000"/>
-          <w:sz w:val="18"/>
-          <w:u w:val="none"/>
-        </w:rPr>
-        <w:t>Implemented atomic inventory reservation that rejects overselling and records movements; passed all data-quality gates and 22 pgTAP assertions on PostgreSQL 14.</w:t>
-      </w:r>
-    </w:p>
-    <w:p>
-      <w:pPr>
-        <w:keepNext/>
-        <w:widowControl/>
-        <w:tabs>
-          <w:tab w:pos="10872" w:val="right"/>
-        </w:tabs>
-        <w:spacing w:before="0" w:after="0" w:line="228" w:lineRule="auto"/>
-      </w:pPr>
-      <w:r>
-        <w:rPr>
-          <w:rFonts w:ascii="Times New Roman" w:hAnsi="Times New Roman" w:eastAsia="Times New Roman"/>
-          <w:b/>
-          <w:color w:val="000000"/>
-          <w:sz w:val="18"/>
-          <w:u w:val="none"/>
-        </w:rPr>
-        <w:t>Cloud Job Queue</w:t>
-      </w:r>
-      <w:r>
-        <w:rPr>
-          <w:rFonts w:ascii="Times New Roman" w:hAnsi="Times New Roman" w:eastAsia="Times New Roman"/>
-          <w:b w:val="0"/>
-          <w:color w:val="000000"/>
-          <w:sz w:val="18"/>
-          <w:u w:val="none"/>
-        </w:rPr>
-        <w:tab/>
-        <w:t>2026</w:t>
-      </w:r>
-    </w:p>
-    <w:p>
-      <w:pPr>
-        <w:keepNext/>
-        <w:widowControl/>
-        <w:spacing w:before="0" w:after="0" w:line="223" w:lineRule="auto"/>
-      </w:pPr>
-      <w:r>
-        <w:rPr>
-          <w:rFonts w:ascii="Times New Roman" w:hAnsi="Times New Roman" w:eastAsia="Times New Roman"/>
-          <w:b w:val="0"/>
-          <w:color w:val="000000"/>
-          <w:sz w:val="18"/>
-          <w:u w:val="none"/>
-        </w:rPr>
-        <w:t>FastAPI / Celery / Redis / Docker</w:t>
-      </w:r>
-    </w:p>
-    <w:p>
-      <w:pPr>
-        <w:keepNext/>
-        <w:widowControl/>
-        <w:spacing w:before="0" w:after="0" w:line="230" w:lineRule="auto"/>
-        <w:ind w:left="331" w:hanging="187"/>
-        <w:numPr>
-          <w:ilvl w:val="0"/>
-          <w:numId w:val="9"/>
-        </w:numPr>
-      </w:pPr>
-      <w:r>
-        <w:rPr>
-          <w:rFonts w:ascii="Times New Roman" w:hAnsi="Times New Roman" w:eastAsia="Times New Roman"/>
-          <w:b w:val="0"/>
-          <w:color w:val="000000"/>
-          <w:sz w:val="18"/>
-          <w:u w:val="none"/>
-        </w:rPr>
-        <w:t>Built an idempotent report API and responsive queue console with queued, running, completed, failed, and dead-letter states, metrics, retries, and recovery controls.</w:t>
-      </w:r>
-    </w:p>
-    <w:p>
-      <w:pPr>
-        <w:keepNext w:val="0"/>
-        <w:widowControl/>
-        <w:spacing w:before="0" w:after="24" w:line="230" w:lineRule="auto"/>
-        <w:ind w:left="331" w:hanging="187"/>
-        <w:numPr>
-          <w:ilvl w:val="0"/>
-          <w:numId w:val="9"/>
-        </w:numPr>
-      </w:pPr>
-      <w:r>
-        <w:rPr>
-          <w:rFonts w:ascii="Times New Roman" w:hAnsi="Times New Roman" w:eastAsia="Times New Roman"/>
-          <w:b w:val="0"/>
-          <w:color w:val="000000"/>
-          <w:sz w:val="18"/>
-          <w:u w:val="none"/>
-        </w:rPr>
-        <w:t>Verified separate API, Redis, and Celery worker processes end to end; passed 8 API tests at 84% coverage, including transient retry and three-attempt dead-letter behavior.</w:t>
-      </w:r>
-    </w:p>
-    <w:p>
-      <w:pPr>
-        <w:keepNext/>
-        <w:widowControl/>
-        <w:tabs>
-          <w:tab w:pos="10872" w:val="right"/>
-        </w:tabs>
-        <w:spacing w:before="0" w:after="0" w:line="228" w:lineRule="auto"/>
-      </w:pPr>
-      <w:r>
-        <w:rPr>
-          <w:rFonts w:ascii="Times New Roman" w:hAnsi="Times New Roman" w:eastAsia="Times New Roman"/>
-          <w:b/>
-          <w:color w:val="000000"/>
-          <w:sz w:val="18"/>
-          <w:u w:val="none"/>
-        </w:rPr>
-        <w:t>FarmData2 Fork Contribution</w:t>
-      </w:r>
-      <w:r>
-        <w:rPr>
-          <w:rFonts w:ascii="Times New Roman" w:hAnsi="Times New Roman" w:eastAsia="Times New Roman"/>
-          <w:b w:val="0"/>
-          <w:color w:val="000000"/>
-          <w:sz w:val="18"/>
+        <w:spacing w:after="0" w:line="240" w:lineRule="auto"/>
+      </w:pPr>
+      <w:hyperlink r:id="rId16" w:tooltip="Open project link">
+        <w:r>
+          <w:rPr>
+            <w:rFonts w:ascii="Times New Roman" w:hAnsi="Times New Roman" w:eastAsia="Times New Roman"/>
+            <w:b/>
+            <w:sz w:val="20"/>
+            <w:u w:val="none"/>
+          </w:rPr>
+          <w:t>FarmData2 Repository Workflow</w:t>
+        </w:r>
+      </w:hyperlink>
+      <w:r>
+        <w:rPr>
+          <w:rFonts w:ascii="Times New Roman" w:hAnsi="Times New Roman" w:eastAsia="Times New Roman"/>
+          <w:b w:val="0"/>
+          <w:sz w:val="20"/>
           <w:u w:val="none"/>
         </w:rPr>
         <w:tab/>
@@ -823,80 +755,80 @@
     </w:p>
     <w:p>
       <w:pPr>
-        <w:keepNext/>
-        <w:widowControl/>
-        <w:spacing w:before="0" w:after="0" w:line="223" w:lineRule="auto"/>
-      </w:pPr>
-      <w:r>
-        <w:rPr>
-          <w:rFonts w:ascii="Times New Roman" w:hAnsi="Times New Roman" w:eastAsia="Times New Roman"/>
-          <w:b w:val="0"/>
-          <w:color w:val="000000"/>
-          <w:sz w:val="18"/>
-          <w:u w:val="none"/>
-        </w:rPr>
-        <w:t>JavaScript / Docker / Git</w:t>
-      </w:r>
-    </w:p>
-    <w:p>
-      <w:pPr>
-        <w:keepNext/>
-        <w:widowControl/>
-        <w:spacing w:before="0" w:after="0" w:line="230" w:lineRule="auto"/>
+        <w:spacing w:after="0" w:line="240" w:lineRule="auto"/>
+      </w:pPr>
+      <w:hyperlink r:id="rId17" w:tooltip="Open project link">
+        <w:r>
+          <w:rPr>
+            <w:rFonts w:ascii="Times New Roman" w:hAnsi="Times New Roman" w:eastAsia="Times New Roman"/>
+            <w:b w:val="0"/>
+            <w:sz w:val="20"/>
+            <w:u w:val="none"/>
+          </w:rPr>
+          <w:t>JavaScript / Docker / Git</w:t>
+        </w:r>
+      </w:hyperlink>
+    </w:p>
+    <w:p>
+      <w:pPr>
+        <w:pStyle w:val="ListParagraph"/>
+        <w:spacing w:after="0" w:line="240" w:lineRule="auto"/>
         <w:ind w:left="331" w:hanging="187"/>
-        <w:numPr>
-          <w:ilvl w:val="0"/>
-          <w:numId w:val="9"/>
-        </w:numPr>
-      </w:pPr>
-      <w:r>
-        <w:rPr>
-          <w:rFonts w:ascii="Times New Roman" w:hAnsi="Times New Roman" w:eastAsia="Times New Roman"/>
-          <w:b w:val="0"/>
-          <w:color w:val="000000"/>
-          <w:sz w:val="18"/>
-          <w:u w:val="none"/>
-        </w:rPr>
-        <w:t>Contributed an ONBOARDING.md command correction in a course fork through commit 5de07e3 on the fix-typo-drush branch without claiming ownership of the upstream application.</w:t>
-      </w:r>
-    </w:p>
-    <w:p>
-      <w:pPr>
-        <w:keepNext w:val="0"/>
-        <w:widowControl/>
-        <w:spacing w:before="0" w:after="24" w:line="230" w:lineRule="auto"/>
+      </w:pPr>
+      <w:r>
+        <w:rPr>
+          <w:rFonts w:ascii="Times New Roman" w:hAnsi="Times New Roman" w:eastAsia="Times New Roman"/>
+          <w:b w:val="0"/>
+          <w:sz w:val="19"/>
+          <w:u w:val="none"/>
+        </w:rPr>
+        <w:t>Worked in a larger JavaScript and Docker codebase using Git branches, issue tracking, repository navigation, and pull-request workflow.</w:t>
+      </w:r>
+    </w:p>
+    <w:p>
+      <w:pPr>
+        <w:pStyle w:val="ListParagraph"/>
+        <w:spacing w:after="0" w:line="240" w:lineRule="auto"/>
         <w:ind w:left="331" w:hanging="187"/>
-        <w:numPr>
-          <w:ilvl w:val="0"/>
-          <w:numId w:val="9"/>
-        </w:numPr>
-      </w:pPr>
-      <w:r>
-        <w:rPr>
-          <w:rFonts w:ascii="Times New Roman" w:hAnsi="Times New Roman" w:eastAsia="Times New Roman"/>
-          <w:b w:val="0"/>
-          <w:color w:val="000000"/>
-          <w:sz w:val="18"/>
-          <w:u w:val="none"/>
-        </w:rPr>
-        <w:t>Practiced repository navigation, isolated branch work, documentation review, and traceable Git history inside a larger JavaScript and Docker project.</w:t>
-      </w:r>
-    </w:p>
-    <w:p>
-      <w:pPr>
-        <w:keepNext/>
-        <w:widowControl/>
+      </w:pPr>
+      <w:r>
+        <w:rPr>
+          <w:rFonts w:ascii="Times New Roman" w:hAnsi="Times New Roman" w:eastAsia="Times New Roman"/>
+          <w:b w:val="0"/>
+          <w:sz w:val="19"/>
+          <w:u w:val="none"/>
+        </w:rPr>
+        <w:t>Documented setup notes and codebase observations to show comfort contributing inside an existing project structure.</w:t>
+      </w:r>
+    </w:p>
+    <w:p>
+      <w:pPr>
+        <w:pStyle w:val="ListParagraph"/>
+        <w:spacing w:after="0" w:line="240" w:lineRule="auto"/>
+        <w:ind w:left="331" w:hanging="187"/>
+      </w:pPr>
+      <w:r>
+        <w:rPr>
+          <w:rFonts w:ascii="Times New Roman" w:hAnsi="Times New Roman" w:eastAsia="Times New Roman"/>
+          <w:b w:val="0"/>
+          <w:sz w:val="19"/>
+          <w:u w:val="none"/>
+        </w:rPr>
+        <w:t>Practiced reading unfamiliar modules, tracing setup requirements, and keeping changes organized for review.</w:t>
+      </w:r>
+    </w:p>
+    <w:p>
+      <w:pPr>
         <w:tabs>
-          <w:tab w:pos="10872" w:val="right"/>
+          <w:tab w:pos="10080" w:val="right"/>
         </w:tabs>
-        <w:spacing w:before="0" w:after="0" w:line="228" w:lineRule="auto"/>
+        <w:spacing w:after="0" w:line="240" w:lineRule="auto"/>
       </w:pPr>
       <w:r>
         <w:rPr>
           <w:rFonts w:ascii="Times New Roman" w:hAnsi="Times New Roman" w:eastAsia="Times New Roman"/>
           <w:b/>
-          <w:color w:val="000000"/>
-          <w:sz w:val="18"/>
+          <w:sz w:val="20"/>
           <w:u w:val="none"/>
         </w:rPr>
         <w:t>Relevant Technical Coursework</w:t>
@@ -905,8 +837,7 @@
         <w:rPr>
           <w:rFonts w:ascii="Times New Roman" w:hAnsi="Times New Roman" w:eastAsia="Times New Roman"/>
           <w:b w:val="0"/>
-          <w:color w:val="000000"/>
-          <w:sz w:val="18"/>
+          <w:sz w:val="20"/>
           <w:u w:val="none"/>
         </w:rPr>
         <w:tab/>
@@ -915,16 +846,13 @@
     </w:p>
     <w:p>
       <w:pPr>
-        <w:keepNext/>
-        <w:widowControl/>
-        <w:spacing w:before="0" w:after="0" w:line="223" w:lineRule="auto"/>
-      </w:pPr>
-      <w:r>
-        <w:rPr>
-          <w:rFonts w:ascii="Times New Roman" w:hAnsi="Times New Roman" w:eastAsia="Times New Roman"/>
-          <w:b w:val="0"/>
-          <w:color w:val="000000"/>
-          <w:sz w:val="18"/>
+        <w:spacing w:after="0" w:line="240" w:lineRule="auto"/>
+      </w:pPr>
+      <w:r>
+        <w:rPr>
+          <w:rFonts w:ascii="Times New Roman" w:hAnsi="Times New Roman" w:eastAsia="Times New Roman"/>
+          <w:b w:val="0"/>
+          <w:sz w:val="20"/>
           <w:u w:val="none"/>
         </w:rPr>
         <w:t>Computer Science Coursework</w:t>
@@ -932,38 +860,66 @@
     </w:p>
     <w:p>
       <w:pPr>
-        <w:keepNext w:val="0"/>
-        <w:widowControl/>
-        <w:spacing w:before="0" w:after="24" w:line="230" w:lineRule="auto"/>
+        <w:pStyle w:val="ListParagraph"/>
+        <w:spacing w:after="0" w:line="240" w:lineRule="auto"/>
         <w:ind w:left="331" w:hanging="187"/>
-        <w:numPr>
-          <w:ilvl w:val="0"/>
-          <w:numId w:val="9"/>
-        </w:numPr>
-      </w:pPr>
-      <w:r>
-        <w:rPr>
-          <w:rFonts w:ascii="Times New Roman" w:hAnsi="Times New Roman" w:eastAsia="Times New Roman"/>
-          <w:b w:val="0"/>
-          <w:color w:val="000000"/>
-          <w:sz w:val="18"/>
-          <w:u w:val="none"/>
-        </w:rPr>
-        <w:t>Data Structures; Algorithm Analysis; Database Design &amp; Applications; UNIX Systems Programming; Operating Systems; Computer Networking &amp; Security; Data Mining; Big Data Analytics Capstone; Cloud/Parallel/Distributed Computing; Software Construction/Design/Architecture; Computer Organization &amp; Architecture; Probability &amp; Statistics; Technical Writing.</w:t>
-      </w:r>
-    </w:p>
-    <w:p>
-      <w:pPr>
-        <w:keepNext/>
-        <w:widowControl/>
-        <w:spacing w:before="84" w:after="16" w:line="228" w:lineRule="auto"/>
+      </w:pPr>
+      <w:r>
+        <w:rPr>
+          <w:rFonts w:ascii="Times New Roman" w:hAnsi="Times New Roman" w:eastAsia="Times New Roman"/>
+          <w:b w:val="0"/>
+          <w:sz w:val="19"/>
+          <w:u w:val="none"/>
+        </w:rPr>
+        <w:t>Applied coursework across Data Structures, Algorithm Analysis, Database Design &amp; Applications, UNIX Systems Programming, Operating Systems, Computer Networking &amp; Security, Data Mining, Big Data Analytics Capstone, Cloud/Parallel/Distributed Computing, Software Construction/Design/Architecture, Computer Organization &amp; Architecture, Probability &amp; Statistics, Technical Writing.</w:t>
+      </w:r>
+    </w:p>
+    <w:p>
+      <w:pPr>
+        <w:pStyle w:val="ListParagraph"/>
+        <w:spacing w:after="0" w:line="240" w:lineRule="auto"/>
+        <w:ind w:left="331" w:hanging="187"/>
+      </w:pPr>
+      <w:r>
+        <w:rPr>
+          <w:rFonts w:ascii="Times New Roman" w:hAnsi="Times New Roman" w:eastAsia="Times New Roman"/>
+          <w:b w:val="0"/>
+          <w:sz w:val="19"/>
+          <w:u w:val="none"/>
+        </w:rPr>
+        <w:t>Connected class projects to practical software, data, systems, documentation, and analysis workflows.</w:t>
+      </w:r>
+    </w:p>
+    <w:p>
+      <w:pPr>
+        <w:pStyle w:val="ListParagraph"/>
+        <w:spacing w:after="0" w:line="240" w:lineRule="auto"/>
+        <w:ind w:left="331" w:hanging="187"/>
+      </w:pPr>
+      <w:r>
+        <w:rPr>
+          <w:rFonts w:ascii="Times New Roman" w:hAnsi="Times New Roman" w:eastAsia="Times New Roman"/>
+          <w:b w:val="0"/>
+          <w:sz w:val="19"/>
+          <w:u w:val="none"/>
+        </w:rPr>
+        <w:t>Used Software Construction and Technical Writing coursework to organize project notes, testing steps, and implementation summaries.</w:t>
+      </w:r>
+    </w:p>
+    <w:p>
+      <w:pPr>
+        <w:spacing w:after="0" w:line="240" w:lineRule="auto"/>
+      </w:pPr>
+    </w:p>
+    <w:p>
+      <w:pPr>
+        <w:spacing w:after="0" w:line="240" w:lineRule="auto"/>
       </w:pPr>
       <w:r>
         <w:rPr>
           <w:rFonts w:ascii="Times New Roman" w:hAnsi="Times New Roman" w:eastAsia="Times New Roman"/>
           <w:b/>
-          <w:color w:val="000000"/>
-          <w:sz w:val="22"/>
+          <w:sz w:val="24"/>
           <w:u w:val="single"/>
         </w:rPr>
         <w:t>SKILLS</w:t>
@@ -971,97 +927,87 @@
     </w:p>
     <w:p>
       <w:pPr>
-        <w:keepNext w:val="0"/>
-        <w:widowControl/>
-        <w:spacing w:before="0" w:after="0" w:line="226" w:lineRule="auto"/>
+        <w:spacing w:after="0" w:line="240" w:lineRule="auto"/>
       </w:pPr>
       <w:r>
         <w:rPr>
           <w:rFonts w:ascii="Times New Roman" w:hAnsi="Times New Roman" w:eastAsia="Times New Roman"/>
           <w:b/>
-          <w:color w:val="000000"/>
-          <w:sz w:val="18"/>
-          <w:u w:val="none"/>
-        </w:rPr>
-        <w:t xml:space="preserve">Languages: </w:t>
-      </w:r>
-      <w:r>
-        <w:rPr>
-          <w:rFonts w:ascii="Times New Roman" w:hAnsi="Times New Roman" w:eastAsia="Times New Roman"/>
-          <w:b w:val="0"/>
-          <w:color w:val="000000"/>
-          <w:sz w:val="18"/>
-          <w:u w:val="none"/>
-        </w:rPr>
-        <w:t>TypeScript, Python, C/C++, JavaScript, SQL, Bash/Shell</w:t>
-      </w:r>
-    </w:p>
-    <w:p>
-      <w:pPr>
-        <w:keepNext w:val="0"/>
-        <w:widowControl/>
-        <w:spacing w:before="0" w:after="0" w:line="226" w:lineRule="auto"/>
+          <w:sz w:val="20"/>
+          <w:u w:val="none"/>
+        </w:rPr>
+        <w:t xml:space="preserve">Programming Languages: </w:t>
+      </w:r>
+      <w:r>
+        <w:rPr>
+          <w:rFonts w:ascii="Times New Roman" w:hAnsi="Times New Roman" w:eastAsia="Times New Roman"/>
+          <w:b w:val="0"/>
+          <w:sz w:val="20"/>
+          <w:u w:val="none"/>
+        </w:rPr>
+        <w:t>Python, C/C++, SQL, JavaScript, Bash/Shell</w:t>
+      </w:r>
+    </w:p>
+    <w:p>
+      <w:pPr>
+        <w:spacing w:after="0" w:line="240" w:lineRule="auto"/>
       </w:pPr>
       <w:r>
         <w:rPr>
           <w:rFonts w:ascii="Times New Roman" w:hAnsi="Times New Roman" w:eastAsia="Times New Roman"/>
           <w:b/>
-          <w:color w:val="000000"/>
-          <w:sz w:val="18"/>
-          <w:u w:val="none"/>
-        </w:rPr>
-        <w:t xml:space="preserve">Web &amp; Data: </w:t>
-      </w:r>
-      <w:r>
-        <w:rPr>
-          <w:rFonts w:ascii="Times New Roman" w:hAnsi="Times New Roman" w:eastAsia="Times New Roman"/>
-          <w:b w:val="0"/>
-          <w:color w:val="000000"/>
-          <w:sz w:val="18"/>
-          <w:u w:val="none"/>
-        </w:rPr>
-        <w:t>Next.js, React, FastAPI, REST, OpenAPI, PostgreSQL, Supabase, pandas, Streamlit, Plotly</w:t>
-      </w:r>
-    </w:p>
-    <w:p>
-      <w:pPr>
-        <w:keepNext w:val="0"/>
-        <w:widowControl/>
-        <w:spacing w:before="0" w:after="0" w:line="226" w:lineRule="auto"/>
+          <w:sz w:val="20"/>
+          <w:u w:val="none"/>
+        </w:rPr>
+        <w:t xml:space="preserve">Systems &amp; Tools: </w:t>
+      </w:r>
+      <w:r>
+        <w:rPr>
+          <w:rFonts w:ascii="Times New Roman" w:hAnsi="Times New Roman" w:eastAsia="Times New Roman"/>
+          <w:b w:val="0"/>
+          <w:sz w:val="20"/>
+          <w:u w:val="none"/>
+        </w:rPr>
+        <w:t>Linux/Unix, Git/GitHub, REST APIs, databases, cloud/distributed computing concepts, Netlify, Docker basics</w:t>
+      </w:r>
+    </w:p>
+    <w:p>
+      <w:pPr>
+        <w:spacing w:after="0" w:line="240" w:lineRule="auto"/>
       </w:pPr>
       <w:r>
         <w:rPr>
           <w:rFonts w:ascii="Times New Roman" w:hAnsi="Times New Roman" w:eastAsia="Times New Roman"/>
           <w:b/>
-          <w:color w:val="000000"/>
-          <w:sz w:val="18"/>
-          <w:u w:val="none"/>
-        </w:rPr>
-        <w:t xml:space="preserve">Systems &amp; Testing: </w:t>
-      </w:r>
-      <w:r>
-        <w:rPr>
-          <w:rFonts w:ascii="Times New Roman" w:hAnsi="Times New Roman" w:eastAsia="Times New Roman"/>
-          <w:b w:val="0"/>
-          <w:color w:val="000000"/>
-          <w:sz w:val="18"/>
-          <w:u w:val="none"/>
-        </w:rPr>
-        <w:t>Linux/Unix, Git/GitHub, Docker, Redis, Celery, GitHub Actions, pytest, Vitest, Playwright, Bats, ShellCheck</w:t>
-      </w:r>
-    </w:p>
-    <w:p>
-      <w:pPr>
-        <w:keepNext/>
-        <w:widowControl/>
-        <w:spacing w:before="84" w:after="16" w:line="228" w:lineRule="auto"/>
+          <w:sz w:val="20"/>
+          <w:u w:val="none"/>
+        </w:rPr>
+        <w:t xml:space="preserve">Data &amp; Documentation: </w:t>
+      </w:r>
+      <w:r>
+        <w:rPr>
+          <w:rFonts w:ascii="Times New Roman" w:hAnsi="Times New Roman" w:eastAsia="Times New Roman"/>
+          <w:b w:val="0"/>
+          <w:sz w:val="20"/>
+          <w:u w:val="none"/>
+        </w:rPr>
+        <w:t>Data mining, dashboard metrics, query design, technical writing, test documentation, workflow notes</w:t>
+      </w:r>
+    </w:p>
+    <w:p>
+      <w:pPr>
+        <w:spacing w:after="0" w:line="240" w:lineRule="auto"/>
+      </w:pPr>
+    </w:p>
+    <w:p>
+      <w:pPr>
+        <w:spacing w:after="0" w:line="240" w:lineRule="auto"/>
       </w:pPr>
       <w:r>
         <w:rPr>
           <w:rFonts w:ascii="Times New Roman" w:hAnsi="Times New Roman" w:eastAsia="Times New Roman"/>
           <w:b/>
-          <w:color w:val="000000"/>
-          <w:sz w:val="22"/>
+          <w:sz w:val="24"/>
           <w:u w:val="single"/>
         </w:rPr>
         <w:t>AWARDS</w:t>
@@ -1069,19 +1015,16 @@
     </w:p>
     <w:p>
       <w:pPr>
-        <w:keepNext w:val="0"/>
-        <w:widowControl/>
         <w:tabs>
-          <w:tab w:pos="10872" w:val="right"/>
+          <w:tab w:pos="10080" w:val="right"/>
         </w:tabs>
-        <w:spacing w:before="0" w:after="0" w:line="228" w:lineRule="auto"/>
-      </w:pPr>
-      <w:r>
-        <w:rPr>
-          <w:rFonts w:ascii="Times New Roman" w:hAnsi="Times New Roman" w:eastAsia="Times New Roman"/>
-          <w:b w:val="0"/>
-          <w:color w:val="000000"/>
-          <w:sz w:val="18"/>
+        <w:spacing w:after="0" w:line="240" w:lineRule="auto"/>
+      </w:pPr>
+      <w:r>
+        <w:rPr>
+          <w:rFonts w:ascii="Times New Roman" w:hAnsi="Times New Roman" w:eastAsia="Times New Roman"/>
+          <w:b w:val="0"/>
+          <w:sz w:val="20"/>
           <w:u w:val="none"/>
         </w:rPr>
         <w:t>Dean's List</w:t>
@@ -1090,8 +1033,7 @@
         <w:rPr>
           <w:rFonts w:ascii="Times New Roman" w:hAnsi="Times New Roman" w:eastAsia="Times New Roman"/>
           <w:b w:val="0"/>
-          <w:color w:val="000000"/>
-          <w:sz w:val="18"/>
+          <w:sz w:val="20"/>
           <w:u w:val="none"/>
         </w:rPr>
         <w:tab/>
@@ -1100,7 +1042,7 @@
     </w:p>
     <w:sectPr>
       <w:pgSz w:w="12240" w:h="15840"/>
-      <w:pgMar w:top="518" w:right="605" w:bottom="518" w:left="605" w:header="288" w:footer="288" w:gutter="0"/>
+      <w:pgMar w:top="720" w:right="720" w:bottom="720" w:left="720" w:header="720" w:footer="720" w:gutter="0"/>
       <w:cols w:space="720"/>
       <w:docGrid w:linePitch="360"/>
     </w:sectPr>
@@ -2037,24 +1979,6 @@
   </w:num>
   <w:num w:numId="8" w16cid:durableId="1082407133">
     <w:abstractNumId w:val="3"/>
-  </w:num>
-  <w:abstractNum w:abstractNumId="8">
-    <w:multiLevelType w:val="singleLevel"/>
-    <w:lvl w:ilvl="0">
-      <w:start w:val="1"/>
-      <w:numFmt w:val="bullet"/>
-      <w:lvlText w:val="•"/>
-      <w:lvlJc w:val="left"/>
-      <w:pPr>
-        <w:ind w:left="330" w:hanging="180"/>
-      </w:pPr>
-      <w:rPr>
-        <w:rFonts w:ascii="Symbol" w:hAnsi="Symbol"/>
-      </w:rPr>
-    </w:lvl>
-  </w:abstractNum>
-  <w:num w:numId="9">
-    <w:abstractNumId w:val="8"/>
   </w:num>
 </w:numbering>
 </file>

</xml_diff>

<commit_message>
Show project repository links in resume
</commit_message>
<xml_diff>
--- a/Yousef_A_Hassan_Resume.docx
+++ b/Yousef_A_Hassan_Resume.docx
@@ -227,6 +227,29 @@
         <w:rPr>
           <w:rFonts w:ascii="Times New Roman" w:hAnsi="Times New Roman" w:eastAsia="Times New Roman"/>
           <w:b w:val="0"/>
+          <w:sz w:val="17"/>
+          <w:u w:val="none"/>
+          <w:szCs w:val="17"/>
+        </w:rPr>
+        <w:t xml:space="preserve">  </w:t>
+      </w:r>
+      <w:hyperlink r:id="rId11">
+        <w:r>
+          <w:rPr>
+            <w:rFonts w:ascii="Times New Roman" w:hAnsi="Times New Roman" w:eastAsia="Times New Roman"/>
+            <w:b w:val="0"/>
+            <w:sz w:val="17"/>
+            <w:u w:val="single"/>
+            <w:color w:val="2457A6"/>
+            <w:szCs w:val="17"/>
+          </w:rPr>
+          <w:t>GitHub</w:t>
+        </w:r>
+      </w:hyperlink>
+      <w:r>
+        <w:rPr>
+          <w:rFonts w:ascii="Times New Roman" w:hAnsi="Times New Roman" w:eastAsia="Times New Roman"/>
+          <w:b w:val="0"/>
           <w:sz w:val="20"/>
           <w:u w:val="none"/>
         </w:rPr>
@@ -334,6 +357,29 @@
         <w:rPr>
           <w:rFonts w:ascii="Times New Roman" w:hAnsi="Times New Roman" w:eastAsia="Times New Roman"/>
           <w:b w:val="0"/>
+          <w:sz w:val="17"/>
+          <w:u w:val="none"/>
+          <w:szCs w:val="17"/>
+        </w:rPr>
+        <w:t xml:space="preserve">  </w:t>
+      </w:r>
+      <w:hyperlink r:id="rId12">
+        <w:r>
+          <w:rPr>
+            <w:rFonts w:ascii="Times New Roman" w:hAnsi="Times New Roman" w:eastAsia="Times New Roman"/>
+            <w:b w:val="0"/>
+            <w:sz w:val="17"/>
+            <w:u w:val="single"/>
+            <w:color w:val="2457A6"/>
+            <w:szCs w:val="17"/>
+          </w:rPr>
+          <w:t>GitHub</w:t>
+        </w:r>
+      </w:hyperlink>
+      <w:r>
+        <w:rPr>
+          <w:rFonts w:ascii="Times New Roman" w:hAnsi="Times New Roman" w:eastAsia="Times New Roman"/>
+          <w:b w:val="0"/>
           <w:sz w:val="20"/>
           <w:u w:val="none"/>
         </w:rPr>
@@ -441,6 +487,29 @@
         <w:rPr>
           <w:rFonts w:ascii="Times New Roman" w:hAnsi="Times New Roman" w:eastAsia="Times New Roman"/>
           <w:b w:val="0"/>
+          <w:sz w:val="17"/>
+          <w:u w:val="none"/>
+          <w:szCs w:val="17"/>
+        </w:rPr>
+        <w:t xml:space="preserve">  </w:t>
+      </w:r>
+      <w:hyperlink r:id="rId13">
+        <w:r>
+          <w:rPr>
+            <w:rFonts w:ascii="Times New Roman" w:hAnsi="Times New Roman" w:eastAsia="Times New Roman"/>
+            <w:b w:val="0"/>
+            <w:sz w:val="17"/>
+            <w:u w:val="single"/>
+            <w:color w:val="2457A6"/>
+            <w:szCs w:val="17"/>
+          </w:rPr>
+          <w:t>GitHub</w:t>
+        </w:r>
+      </w:hyperlink>
+      <w:r>
+        <w:rPr>
+          <w:rFonts w:ascii="Times New Roman" w:hAnsi="Times New Roman" w:eastAsia="Times New Roman"/>
+          <w:b w:val="0"/>
           <w:sz w:val="20"/>
           <w:u w:val="none"/>
         </w:rPr>
@@ -548,6 +617,29 @@
         <w:rPr>
           <w:rFonts w:ascii="Times New Roman" w:hAnsi="Times New Roman" w:eastAsia="Times New Roman"/>
           <w:b w:val="0"/>
+          <w:sz w:val="17"/>
+          <w:u w:val="none"/>
+          <w:szCs w:val="17"/>
+        </w:rPr>
+        <w:t xml:space="preserve">  </w:t>
+      </w:r>
+      <w:hyperlink r:id="rId14">
+        <w:r>
+          <w:rPr>
+            <w:rFonts w:ascii="Times New Roman" w:hAnsi="Times New Roman" w:eastAsia="Times New Roman"/>
+            <w:b w:val="0"/>
+            <w:sz w:val="17"/>
+            <w:u w:val="single"/>
+            <w:color w:val="2457A6"/>
+            <w:szCs w:val="17"/>
+          </w:rPr>
+          <w:t>GitHub</w:t>
+        </w:r>
+      </w:hyperlink>
+      <w:r>
+        <w:rPr>
+          <w:rFonts w:ascii="Times New Roman" w:hAnsi="Times New Roman" w:eastAsia="Times New Roman"/>
+          <w:b w:val="0"/>
           <w:sz w:val="20"/>
           <w:u w:val="none"/>
         </w:rPr>
@@ -655,6 +747,29 @@
         <w:rPr>
           <w:rFonts w:ascii="Times New Roman" w:hAnsi="Times New Roman" w:eastAsia="Times New Roman"/>
           <w:b w:val="0"/>
+          <w:sz w:val="17"/>
+          <w:u w:val="none"/>
+          <w:szCs w:val="17"/>
+        </w:rPr>
+        <w:t xml:space="preserve">  </w:t>
+      </w:r>
+      <w:hyperlink r:id="rId15">
+        <w:r>
+          <w:rPr>
+            <w:rFonts w:ascii="Times New Roman" w:hAnsi="Times New Roman" w:eastAsia="Times New Roman"/>
+            <w:b w:val="0"/>
+            <w:sz w:val="17"/>
+            <w:u w:val="single"/>
+            <w:color w:val="2457A6"/>
+            <w:szCs w:val="17"/>
+          </w:rPr>
+          <w:t>GitHub</w:t>
+        </w:r>
+      </w:hyperlink>
+      <w:r>
+        <w:rPr>
+          <w:rFonts w:ascii="Times New Roman" w:hAnsi="Times New Roman" w:eastAsia="Times New Roman"/>
+          <w:b w:val="0"/>
           <w:sz w:val="20"/>
           <w:u w:val="none"/>
         </w:rPr>
@@ -746,6 +861,29 @@
         <w:rPr>
           <w:rFonts w:ascii="Times New Roman" w:hAnsi="Times New Roman" w:eastAsia="Times New Roman"/>
           <w:b w:val="0"/>
+          <w:sz w:val="17"/>
+          <w:u w:val="none"/>
+          <w:szCs w:val="17"/>
+        </w:rPr>
+        <w:t xml:space="preserve">  </w:t>
+      </w:r>
+      <w:hyperlink r:id="rId17">
+        <w:r>
+          <w:rPr>
+            <w:rFonts w:ascii="Times New Roman" w:hAnsi="Times New Roman" w:eastAsia="Times New Roman"/>
+            <w:b w:val="0"/>
+            <w:sz w:val="17"/>
+            <w:u w:val="single"/>
+            <w:color w:val="2457A6"/>
+            <w:szCs w:val="17"/>
+          </w:rPr>
+          <w:t>GitHub</w:t>
+        </w:r>
+      </w:hyperlink>
+      <w:r>
+        <w:rPr>
+          <w:rFonts w:ascii="Times New Roman" w:hAnsi="Times New Roman" w:eastAsia="Times New Roman"/>
+          <w:b w:val="0"/>
           <w:sz w:val="20"/>
           <w:u w:val="none"/>
         </w:rPr>
@@ -757,7 +895,7 @@
       <w:pPr>
         <w:spacing w:after="0" w:line="240" w:lineRule="auto"/>
       </w:pPr>
-      <w:hyperlink r:id="rId17" w:tooltip="Open project link">
+      <w:hyperlink r:id="rId18" w:tooltip="Open project link">
         <w:r>
           <w:rPr>
             <w:rFonts w:ascii="Times New Roman" w:hAnsi="Times New Roman" w:eastAsia="Times New Roman"/>

</xml_diff>